<commit_message>
start of job applying season
</commit_message>
<xml_diff>
--- a/writing_blobs/solicitaties/sollicitatie_technoberg.docx
+++ b/writing_blobs/solicitaties/sollicitatie_technoberg.docx
@@ -31,13 +31,8 @@
       <w:r>
         <w:t xml:space="preserve"> </w:t>
       </w:r>
-      <w:proofErr w:type="spellStart"/>
-      <w:r>
-        <w:t>Qutayba</w:t>
-      </w:r>
-      <w:proofErr w:type="spellEnd"/>
-      <w:r>
-        <w:t xml:space="preserve"> Ali</w:t>
+      <w:r>
+        <w:t>Qutayba Ali</w:t>
       </w:r>
       <w:r>
         <w:t xml:space="preserve">,  </w:t>
@@ -46,15 +41,7 @@
     <w:p/>
     <w:p>
       <w:r>
-        <w:t xml:space="preserve">Op de open dag  van het Mediacollege Amsterdam sprak ik met Erik Spijkerman over de opleiding Software Development en stage lopen  bij </w:t>
-      </w:r>
-      <w:proofErr w:type="spellStart"/>
-      <w:r>
-        <w:t>Technoberg</w:t>
-      </w:r>
-      <w:proofErr w:type="spellEnd"/>
-      <w:r>
-        <w:t xml:space="preserve">. Ik had een goede klik met Erik, Ik kreeg een positieve indruk van jullie bedrijf. Het klinkt bij jullie als een plek met een open, gemoedelijke sfeer. </w:t>
+        <w:t xml:space="preserve">Op de open dag  van het Mediacollege Amsterdam sprak ik met Erik Spijkerman over de opleiding Software Development en stage lopen  bij Technoberg. Ik had een goede klik met Erik, Ik kreeg een positieve indruk van jullie bedrijf. Het klinkt bij jullie als een plek met een open, gemoedelijke sfeer. </w:t>
       </w:r>
     </w:p>
     <w:p>
@@ -215,150 +202,30 @@
         <w:t>erkmethode</w:t>
       </w:r>
       <w:r>
-        <w:t xml:space="preserve">: C#, C, Java(/type)script, </w:t>
-      </w:r>
-      <w:proofErr w:type="spellStart"/>
-      <w:r>
-        <w:t>svelte</w:t>
-      </w:r>
-      <w:proofErr w:type="spellEnd"/>
-      <w:r>
-        <w:t xml:space="preserve">, </w:t>
-      </w:r>
-      <w:proofErr w:type="spellStart"/>
-      <w:r>
-        <w:t>npm</w:t>
-      </w:r>
-      <w:proofErr w:type="spellEnd"/>
-      <w:r>
-        <w:t xml:space="preserve">, git, </w:t>
-      </w:r>
-      <w:proofErr w:type="spellStart"/>
-      <w:r>
-        <w:t>linux</w:t>
-      </w:r>
-      <w:proofErr w:type="spellEnd"/>
-      <w:r>
-        <w:t>(</w:t>
-      </w:r>
-      <w:proofErr w:type="spellStart"/>
-      <w:r>
-        <w:t>Fedora</w:t>
-      </w:r>
-      <w:proofErr w:type="spellEnd"/>
-      <w:r>
-        <w:t xml:space="preserve">, </w:t>
-      </w:r>
-      <w:proofErr w:type="spellStart"/>
-      <w:r>
-        <w:t>Nixos</w:t>
-      </w:r>
-      <w:proofErr w:type="spellEnd"/>
-      <w:r>
-        <w:t xml:space="preserve">), </w:t>
-      </w:r>
-      <w:proofErr w:type="spellStart"/>
-      <w:r>
-        <w:t>unity</w:t>
-      </w:r>
-      <w:proofErr w:type="spellEnd"/>
-      <w:r>
-        <w:t xml:space="preserve">, </w:t>
-      </w:r>
-      <w:proofErr w:type="spellStart"/>
-      <w:r>
-        <w:t>unreal</w:t>
-      </w:r>
-      <w:proofErr w:type="spellEnd"/>
-      <w:r>
-        <w:t xml:space="preserve"> engine 5, </w:t>
-      </w:r>
-      <w:proofErr w:type="spellStart"/>
-      <w:r>
-        <w:t>neovim</w:t>
-      </w:r>
-      <w:proofErr w:type="spellEnd"/>
-      <w:r>
-        <w:t xml:space="preserve">, JB Rider (en andere varianten), </w:t>
-      </w:r>
-      <w:proofErr w:type="spellStart"/>
-      <w:r>
-        <w:t>dotpeek</w:t>
-      </w:r>
-      <w:proofErr w:type="spellEnd"/>
-      <w:r>
-        <w:t xml:space="preserve">, </w:t>
-      </w:r>
-      <w:proofErr w:type="spellStart"/>
-      <w:r>
-        <w:t>dnspy</w:t>
-      </w:r>
-      <w:proofErr w:type="spellEnd"/>
-      <w:r>
-        <w:t>, reverse engineering en</w:t>
+        <w:t>: C#, C, Java(/type)script, svelte, npm, git, linux(Fedora, Nixos), unity, unreal engine 5, neovim, JB Rider (en andere varianten), dotpeek, dnspy, reverse engineering en</w:t>
       </w:r>
       <w:r>
         <w:t xml:space="preserve"> </w:t>
       </w:r>
       <w:r>
-        <w:t>Scrum (</w:t>
-      </w:r>
-      <w:proofErr w:type="spellStart"/>
-      <w:r>
-        <w:t>trello</w:t>
-      </w:r>
-      <w:proofErr w:type="spellEnd"/>
-      <w:r>
-        <w:t>/</w:t>
-      </w:r>
-      <w:proofErr w:type="spellStart"/>
-      <w:r>
-        <w:t>github’s</w:t>
-      </w:r>
-      <w:proofErr w:type="spellEnd"/>
+        <w:t>Scrum (trello/github’s trello clone).</w:t>
+      </w:r>
+    </w:p>
+    <w:p>
+      <w:pPr>
+        <w:ind w:left="-20" w:right="-20"/>
+      </w:pPr>
+      <w:r>
+        <w:t xml:space="preserve">Projecten waar ik op school aan gewerkt heb, zijn o.a. de Open Toren Dag van de gemeente Amsterdam, </w:t>
+      </w:r>
+      <w:r>
+        <w:t>waarbij onze groep een VR-omgeving van</w:t>
+      </w:r>
       <w:r>
         <w:t xml:space="preserve"> </w:t>
       </w:r>
-      <w:proofErr w:type="spellStart"/>
-      <w:r>
-        <w:t>trello</w:t>
-      </w:r>
-      <w:proofErr w:type="spellEnd"/>
-      <w:r>
-        <w:t xml:space="preserve"> </w:t>
-      </w:r>
-      <w:proofErr w:type="spellStart"/>
-      <w:r>
-        <w:t>clone</w:t>
-      </w:r>
-      <w:proofErr w:type="spellEnd"/>
-      <w:r>
-        <w:t>).</w:t>
-      </w:r>
-    </w:p>
-    <w:p>
-      <w:pPr>
-        <w:ind w:left="-20" w:right="-20"/>
-      </w:pPr>
-      <w:r>
-        <w:t xml:space="preserve">Projecten waar ik op school aan gewerkt heb, zijn o.a. de Open Toren Dag van de gemeente Amsterdam, </w:t>
-      </w:r>
-      <w:r>
-        <w:t>waarbij onze groep een VR-omgeving van</w:t>
-      </w:r>
-      <w:r>
-        <w:t xml:space="preserve"> </w:t>
-      </w:r>
-      <w:r>
-        <w:t xml:space="preserve">de </w:t>
-      </w:r>
-      <w:proofErr w:type="spellStart"/>
-      <w:r>
-        <w:t>Zuidas</w:t>
-      </w:r>
-      <w:proofErr w:type="spellEnd"/>
-      <w:r>
-        <w:t xml:space="preserve"> heeft</w:t>
+      <w:r>
+        <w:t>de Zuidas heeft</w:t>
       </w:r>
       <w:r>
         <w:t xml:space="preserve"> ontwikkeld</w:t>
@@ -367,15 +234,7 @@
         <w:t>. Daar heb ik</w:t>
       </w:r>
       <w:r>
-        <w:t xml:space="preserve"> ook </w:t>
-      </w:r>
-      <w:proofErr w:type="spellStart"/>
-      <w:r>
-        <w:t>hashing</w:t>
-      </w:r>
-      <w:proofErr w:type="spellEnd"/>
-      <w:r>
-        <w:t xml:space="preserve"> onderzocht en </w:t>
+        <w:t xml:space="preserve"> ook hashing onderzocht en </w:t>
       </w:r>
       <w:r>
         <w:t>geïmplementeerd</w:t>
@@ -387,23 +246,7 @@
         <w:t xml:space="preserve"> heb</w:t>
       </w:r>
       <w:r>
-        <w:t xml:space="preserve"> ik een </w:t>
-      </w:r>
-      <w:proofErr w:type="spellStart"/>
-      <w:r>
-        <w:t>clone</w:t>
-      </w:r>
-      <w:proofErr w:type="spellEnd"/>
-      <w:r>
-        <w:t xml:space="preserve"> gemaakt van </w:t>
-      </w:r>
-      <w:proofErr w:type="spellStart"/>
-      <w:r>
-        <w:t>Conway’s</w:t>
-      </w:r>
-      <w:proofErr w:type="spellEnd"/>
-      <w:r>
-        <w:t xml:space="preserve"> game of life. </w:t>
+        <w:t xml:space="preserve"> ik een clone gemaakt van Conway’s game of life. </w:t>
       </w:r>
     </w:p>
     <w:p>
@@ -472,27 +315,43 @@
     <w:p>
       <w:pPr>
         <w:ind w:left="-20" w:right="-20"/>
-      </w:pPr>
-      <w:r>
+        <w:rPr>
+          <w:lang w:val="en-GB"/>
+        </w:rPr>
+      </w:pPr>
+      <w:r>
+        <w:rPr>
+          <w:lang w:val="en-GB"/>
+        </w:rPr>
         <w:t>Jannes Veuger</w:t>
       </w:r>
     </w:p>
     <w:p>
       <w:pPr>
         <w:ind w:left="-20" w:right="-20"/>
-      </w:pPr>
-      <w:r>
+        <w:rPr>
+          <w:lang w:val="en-GB"/>
+        </w:rPr>
+      </w:pPr>
+      <w:r>
+        <w:rPr>
+          <w:lang w:val="en-GB"/>
+        </w:rPr>
         <w:t>0644816686</w:t>
       </w:r>
     </w:p>
     <w:p>
       <w:pPr>
         <w:ind w:left="-20" w:right="-20"/>
+        <w:rPr>
+          <w:lang w:val="en-GB"/>
+        </w:rPr>
       </w:pPr>
       <w:hyperlink r:id="rId4" w:history="1">
         <w:r>
           <w:rPr>
             <w:rStyle w:val="Hyperlink"/>
+            <w:lang w:val="en-GB"/>
           </w:rPr>
           <w:t>jannesveuger@xs4all.nl</w:t>
         </w:r>
@@ -501,53 +360,191 @@
     <w:p>
       <w:pPr>
         <w:ind w:left="-20" w:right="-20"/>
-      </w:pPr>
-      <w:proofErr w:type="spellStart"/>
-      <w:r>
+        <w:rPr>
+          <w:lang w:val="en-GB"/>
+        </w:rPr>
+      </w:pPr>
+      <w:r>
+        <w:rPr>
+          <w:lang w:val="en-GB"/>
+        </w:rPr>
         <w:lastRenderedPageBreak/>
         <w:t>jannesveuger.dev</w:t>
       </w:r>
-      <w:proofErr w:type="spellEnd"/>
-    </w:p>
-    <w:p>
-      <w:pPr>
-        <w:ind w:left="-20" w:right="-20"/>
-      </w:pPr>
-      <w:r>
+    </w:p>
+    <w:p>
+      <w:pPr>
+        <w:ind w:left="-20" w:right="-20"/>
+        <w:rPr>
+          <w:lang w:val="en-GB"/>
+        </w:rPr>
+      </w:pPr>
+      <w:r>
+        <w:rPr>
+          <w:lang w:val="en-GB"/>
+        </w:rPr>
         <w:t>Bijlage: cv</w:t>
       </w:r>
     </w:p>
     <w:p>
       <w:pPr>
         <w:ind w:left="-20" w:right="-20"/>
-      </w:pPr>
-    </w:p>
-    <w:p>
-      <w:pPr>
-        <w:ind w:left="-20" w:right="-20"/>
-      </w:pPr>
-    </w:p>
-    <w:p>
-      <w:pPr>
-        <w:ind w:left="-20" w:right="-20"/>
-      </w:pPr>
-      <w:r>
+        <w:rPr>
+          <w:lang w:val="en-GB"/>
+        </w:rPr>
+      </w:pPr>
+    </w:p>
+    <w:p>
+      <w:pPr>
+        <w:ind w:left="-20" w:right="-20"/>
+        <w:rPr>
+          <w:lang w:val="en-GB"/>
+        </w:rPr>
+      </w:pPr>
+    </w:p>
+    <w:p>
+      <w:pPr>
+        <w:ind w:left="-20" w:right="-20"/>
+        <w:rPr>
+          <w:lang w:val="en-GB"/>
+        </w:rPr>
+      </w:pPr>
+      <w:r>
+        <w:rPr>
+          <w:lang w:val="en-GB"/>
+        </w:rPr>
         <w:t>[</w:t>
       </w:r>
       <w:r>
         <w:rPr>
           <w:color w:val="EE0000"/>
+          <w:lang w:val="en-GB"/>
         </w:rPr>
         <w:t>T Nummer, E-mail, URL portfolio</w:t>
       </w:r>
       <w:r>
+        <w:rPr>
+          <w:lang w:val="en-GB"/>
+        </w:rPr>
         <w:t>]</w:t>
       </w:r>
       <w:bookmarkEnd w:id="0"/>
     </w:p>
     <w:p>
       <w:pPr>
-        <w:ind w:left="-20" w:right="-20"/>
+        <w:rPr>
+          <w:lang w:val="en-GB"/>
+        </w:rPr>
+      </w:pPr>
+      <w:r>
+        <w:rPr>
+          <w:lang w:val="en-GB"/>
+        </w:rPr>
+        <w:br w:type="page"/>
+      </w:r>
+    </w:p>
+    <w:p>
+      <w:pPr>
+        <w:ind w:left="-20" w:right="-20"/>
+      </w:pPr>
+      <w:r>
+        <w:lastRenderedPageBreak/>
+        <w:t>4,5,2026</w:t>
+      </w:r>
+    </w:p>
+    <w:p>
+      <w:pPr>
+        <w:ind w:left="-20" w:right="-20"/>
+      </w:pPr>
+    </w:p>
+    <w:p>
+      <w:pPr>
+        <w:ind w:left="-20" w:right="-20"/>
+      </w:pPr>
+      <w:r>
+        <w:t>Beste Erik Spijkerman,</w:t>
+      </w:r>
+    </w:p>
+    <w:p>
+      <w:pPr>
+        <w:ind w:left="-20" w:right="-20"/>
+      </w:pPr>
+    </w:p>
+    <w:p>
+      <w:pPr>
+        <w:ind w:left="-20" w:right="-20"/>
+      </w:pPr>
+      <w:r>
+        <w:t>Wij hadden elkaar in januari gesproken op de open dag van het Mediacollege Amsterdam, waarna ik naar Technoberg een sollicitatie voor een stageplaats had gestuurd.</w:t>
+      </w:r>
+    </w:p>
+    <w:p>
+      <w:pPr>
+        <w:ind w:left="-20" w:right="-20"/>
+      </w:pPr>
+    </w:p>
+    <w:p>
+      <w:pPr>
+        <w:ind w:left="-20" w:right="-20"/>
+      </w:pPr>
+      <w:r>
+        <w:t>Jullie hadden toen geen plek, graag zou ik op gesprek komen voor een stage bij jullie in september.</w:t>
+      </w:r>
+    </w:p>
+    <w:p>
+      <w:pPr>
+        <w:ind w:left="-20" w:right="-20"/>
+      </w:pPr>
+    </w:p>
+    <w:p>
+      <w:pPr>
+        <w:ind w:left="-20" w:right="-20"/>
+      </w:pPr>
+      <w:r>
+        <w:t>Hieronder bijgevoegd de sollicitatiemail en mijn CV van toen.</w:t>
+      </w:r>
+    </w:p>
+    <w:p>
+      <w:pPr>
+        <w:ind w:left="-20" w:right="-20"/>
+      </w:pPr>
+    </w:p>
+    <w:p>
+      <w:pPr>
+        <w:ind w:left="-20" w:right="-20"/>
+      </w:pPr>
+      <w:r>
+        <w:t>Ik hoop snel iets van jullie te horen.</w:t>
+      </w:r>
+    </w:p>
+    <w:p>
+      <w:pPr>
+        <w:ind w:left="-20" w:right="-20"/>
+        <w:rPr>
+          <w:lang w:val="en-GB"/>
+        </w:rPr>
+      </w:pPr>
+      <w:r>
+        <w:rPr>
+          <w:lang w:val="en-GB"/>
+        </w:rPr>
+        <w:t>Groet, Jannes Veuger </w:t>
+      </w:r>
+    </w:p>
+    <w:p>
+      <w:pPr>
+        <w:ind w:left="-20" w:right="-20"/>
+        <w:rPr>
+          <w:lang w:val="en-GB"/>
+        </w:rPr>
+      </w:pPr>
+    </w:p>
+    <w:p>
+      <w:pPr>
+        <w:ind w:left="-20" w:right="-20"/>
+        <w:rPr>
+          <w:lang w:val="en-GB"/>
+        </w:rPr>
       </w:pPr>
     </w:p>
     <w:sectPr>

</xml_diff>